<commit_message>
Update: Modifications on Front-end Changes
</commit_message>
<xml_diff>
--- a/frontend/Front-End Change.docx
+++ b/frontend/Front-End Change.docx
@@ -79,17 +79,15 @@
         <w:rPr>
           <w:b/>
           <w:bCs/>
-          <w:sz w:val="32"/>
-          <w:szCs w:val="40"/>
-        </w:rPr>
-      </w:pPr>
-      <w:r>
-        <w:rPr>
-          <w:rFonts w:hint="eastAsia"/>
-          <w:b/>
-          <w:bCs/>
-          <w:sz w:val="32"/>
-          <w:szCs w:val="40"/>
+          <w:sz w:val="24"/>
+        </w:rPr>
+      </w:pPr>
+      <w:r>
+        <w:rPr>
+          <w:rFonts w:hint="eastAsia"/>
+          <w:b/>
+          <w:bCs/>
+          <w:sz w:val="24"/>
         </w:rPr>
         <w:t>1.LoginPage</w:t>
       </w:r>
@@ -213,15 +211,6 @@
       </w:r>
     </w:p>
     <w:p>
-      <w:pPr>
-        <w:jc w:val="center"/>
-      </w:pPr>
-      <w:r>
-        <w:rPr>
-          <w:rFonts w:hint="eastAsia"/>
-        </w:rPr>
-        <w:t xml:space="preserve">①　</w:t>
-      </w:r>
       <w:r>
         <w:rPr>
           <w:rFonts w:hint="eastAsia"/>
@@ -408,20 +397,17 @@
     </w:p>
     <w:p>
       <w:pPr>
-        <w:jc w:val="center"/>
-      </w:pPr>
-    </w:p>
-    <w:p>
-      <w:pPr>
-        <w:numPr>
-          <w:ilvl w:val="0"/>
-          <w:numId w:val="1"/>
-        </w:numPr>
-        <w:rPr>
-          <w:b/>
-          <w:bCs/>
-        </w:rPr>
-      </w:pPr>
+        <w:rPr>
+          <w:b/>
+          <w:bCs/>
+        </w:rPr>
+      </w:pPr>
+      <w:r>
+        <w:rPr>
+          <w:rFonts w:hint="eastAsia"/>
+        </w:rPr>
+        <w:t>1.</w:t>
+      </w:r>
       <w:r>
         <w:rPr>
           <w:rFonts w:hint="eastAsia"/>
@@ -511,27 +497,21 @@
         </w:drawing>
       </w:r>
     </w:p>
-    <w:p/>
-    <w:p>
-      <w:pPr>
-        <w:numPr>
-          <w:ilvl w:val="0"/>
-          <w:numId w:val="1"/>
-        </w:numPr>
-        <w:rPr>
-          <w:b/>
-          <w:bCs/>
-        </w:rPr>
-      </w:pPr>
-    </w:p>
-    <w:p>
-      <w:pPr>
-        <w:rPr>
-          <w:rFonts w:hint="eastAsia"/>
-          <w:b/>
-          <w:bCs/>
-        </w:rPr>
-      </w:pPr>
+    <w:p>
+      <w:pPr>
+        <w:rPr>
+          <w:b/>
+          <w:bCs/>
+        </w:rPr>
+      </w:pPr>
+      <w:r>
+        <w:rPr>
+          <w:rFonts w:hint="eastAsia"/>
+          <w:b/>
+          <w:bCs/>
+        </w:rPr>
+        <w:t xml:space="preserve">2. </w:t>
+      </w:r>
       <w:r>
         <w:rPr>
           <w:rFonts w:hint="eastAsia"/>
@@ -599,6 +579,66 @@
           <w:bCs/>
         </w:rPr>
         <w:t xml:space="preserve">  “message”: “Login code sent”</w:t>
+      </w:r>
+    </w:p>
+    <w:p>
+      <w:pPr>
+        <w:rPr>
+          <w:b/>
+          <w:bCs/>
+        </w:rPr>
+      </w:pPr>
+      <w:r>
+        <w:rPr>
+          <w:b/>
+          <w:bCs/>
+        </w:rPr>
+        <w:t>}</w:t>
+      </w:r>
+    </w:p>
+    <w:p>
+      <w:pPr>
+        <w:rPr>
+          <w:b/>
+          <w:bCs/>
+        </w:rPr>
+      </w:pPr>
+      <w:r>
+        <w:rPr>
+          <w:b/>
+          <w:bCs/>
+        </w:rPr>
+        <w:t>or in case of failure, it might be:</w:t>
+      </w:r>
+    </w:p>
+    <w:p>
+      <w:pPr>
+        <w:rPr>
+          <w:b/>
+          <w:bCs/>
+        </w:rPr>
+      </w:pPr>
+      <w:r>
+        <w:rPr>
+          <w:b/>
+          <w:bCs/>
+        </w:rPr>
+        <w:t>{</w:t>
+      </w:r>
+    </w:p>
+    <w:p>
+      <w:pPr>
+        <w:rPr>
+          <w:b/>
+          <w:bCs/>
+        </w:rPr>
+      </w:pPr>
+      <w:r>
+        <w:rPr>
+          <w:b/>
+          <w:bCs/>
+        </w:rPr>
+        <w:t xml:space="preserve">  “error”: “Invalid email address”</w:t>
       </w:r>
     </w:p>
     <w:p>
@@ -626,68 +666,12 @@
       </w:pPr>
       <w:r>
         <w:rPr>
-          <w:b/>
-          <w:bCs/>
-        </w:rPr>
-        <w:t>or in case of failure, it might be:</w:t>
-      </w:r>
-    </w:p>
-    <w:p>
-      <w:pPr>
-        <w:rPr>
-          <w:b/>
-          <w:bCs/>
-        </w:rPr>
-      </w:pPr>
-      <w:r>
-        <w:rPr>
-          <w:b/>
-          <w:bCs/>
-        </w:rPr>
-        <w:t>{</w:t>
-      </w:r>
-    </w:p>
-    <w:p>
-      <w:pPr>
-        <w:rPr>
-          <w:b/>
-          <w:bCs/>
-        </w:rPr>
-      </w:pPr>
-      <w:r>
-        <w:rPr>
-          <w:b/>
-          <w:bCs/>
-        </w:rPr>
-        <w:t xml:space="preserve">  “error”: “Invalid email address”</w:t>
-      </w:r>
-    </w:p>
-    <w:p>
-      <w:pPr>
-        <w:rPr>
-          <w:b/>
-          <w:bCs/>
-        </w:rPr>
-      </w:pPr>
-      <w:r>
-        <w:rPr>
-          <w:b/>
-          <w:bCs/>
-        </w:rPr>
-        <w:t>}</w:t>
-      </w:r>
-    </w:p>
-    <w:p>
-      <w:pPr>
-        <w:numPr>
-          <w:ilvl w:val="0"/>
-          <w:numId w:val="1"/>
-        </w:numPr>
-        <w:rPr>
-          <w:b/>
-          <w:bCs/>
-        </w:rPr>
-      </w:pPr>
+          <w:rFonts w:hint="eastAsia"/>
+          <w:b/>
+          <w:bCs/>
+        </w:rPr>
+        <w:t>3.</w:t>
+      </w:r>
       <w:r>
         <w:rPr>
           <w:b/>
@@ -874,15 +858,19 @@
     </w:p>
     <w:p>
       <w:pPr>
-        <w:numPr>
-          <w:ilvl w:val="0"/>
-          <w:numId w:val="1"/>
-        </w:numPr>
-        <w:rPr>
-          <w:b/>
-          <w:bCs/>
-        </w:rPr>
-      </w:pPr>
+        <w:rPr>
+          <w:b/>
+          <w:bCs/>
+        </w:rPr>
+      </w:pPr>
+      <w:r>
+        <w:rPr>
+          <w:rFonts w:hint="eastAsia"/>
+          <w:b/>
+          <w:bCs/>
+        </w:rPr>
+        <w:t>4.</w:t>
+      </w:r>
       <w:r>
         <w:rPr>
           <w:rFonts w:hint="eastAsia"/>
@@ -1117,7 +1105,6 @@
         <w:rPr>
           <w:noProof/>
         </w:rPr>
-        <w:lastRenderedPageBreak/>
         <w:drawing>
           <wp:inline distT="0" distB="0" distL="114300" distR="114300" wp14:anchorId="2770B11B" wp14:editId="29472097">
             <wp:extent cx="5269865" cy="222885"/>
@@ -1179,6 +1166,7 @@
         <w:rPr>
           <w:noProof/>
         </w:rPr>
+        <w:lastRenderedPageBreak/>
         <w:drawing>
           <wp:inline distT="0" distB="0" distL="114300" distR="114300" wp14:anchorId="28BA1B25" wp14:editId="06B02F90">
             <wp:extent cx="2936875" cy="1062355"/>
@@ -1350,15 +1338,19 @@
     </w:p>
     <w:p>
       <w:pPr>
-        <w:numPr>
-          <w:ilvl w:val="0"/>
-          <w:numId w:val="1"/>
-        </w:numPr>
-        <w:rPr>
-          <w:b/>
-          <w:bCs/>
-        </w:rPr>
-      </w:pPr>
+        <w:rPr>
+          <w:b/>
+          <w:bCs/>
+        </w:rPr>
+      </w:pPr>
+      <w:r>
+        <w:rPr>
+          <w:rFonts w:hint="eastAsia"/>
+          <w:b/>
+          <w:bCs/>
+        </w:rPr>
+        <w:t>1.</w:t>
+      </w:r>
       <w:r>
         <w:rPr>
           <w:rFonts w:hint="eastAsia"/>
@@ -1370,15 +1362,19 @@
     </w:p>
     <w:p>
       <w:pPr>
-        <w:numPr>
-          <w:ilvl w:val="0"/>
-          <w:numId w:val="1"/>
-        </w:numPr>
-        <w:rPr>
-          <w:b/>
-          <w:bCs/>
-        </w:rPr>
-      </w:pPr>
+        <w:rPr>
+          <w:b/>
+          <w:bCs/>
+        </w:rPr>
+      </w:pPr>
+      <w:r>
+        <w:rPr>
+          <w:rFonts w:hint="eastAsia"/>
+          <w:b/>
+          <w:bCs/>
+        </w:rPr>
+        <w:t>2.</w:t>
+      </w:r>
       <w:r>
         <w:rPr>
           <w:rFonts w:hint="eastAsia"/>
@@ -1419,15 +1415,7 @@
     </w:p>
     <w:p>
       <w:r>
-        <w:t xml:space="preserve">This is a URL, specifically the endpoint address that the frontend must access on the backend. This is the local development address, which may change after cloud deployment. It consists of an HTTP request, host address, and port number; “localhost” indicates the local machine. 8000 is the port the backend program listens </w:t>
-      </w:r>
-      <w:proofErr w:type="gramStart"/>
-      <w:r>
-        <w:t>on</w:t>
-      </w:r>
-      <w:proofErr w:type="gramEnd"/>
-      <w:r>
-        <w:t>, and the /services/send-login-code/ path is the route for the backend interface responsible for this functionality. In other words, the frontend needs to access the “send-login-code interface within the backend service running on port 8000 on this computer.”</w:t>
+        <w:t>This is a URL, specifically the endpoint address that the frontend must access on the backend. This is the local development address, which may change after cloud deployment. It consists of an HTTP request, host address, and port number; “localhost” indicates the local machine. 8000 is the port the backend program listens on, and the /services/send-login-code/ path is the route for the backend interface responsible for this functionality. In other words, the frontend needs to access the “send-login-code interface within the backend service running on port 8000 on this computer.”</w:t>
       </w:r>
     </w:p>
     <w:p>
@@ -1538,39 +1526,26 @@
       </w:r>
     </w:p>
     <w:p>
+      <w:r>
+        <w:t>method: ‘POST’</w:t>
+      </w:r>
+    </w:p>
+    <w:p>
+      <w:r>
+        <w:t>Indicates that this is a POST request, typically used to submit data.</w:t>
+      </w:r>
+    </w:p>
+    <w:p>
+      <w:r>
+        <w:t xml:space="preserve">headers: </w:t>
+      </w:r>
       <w:proofErr w:type="gramStart"/>
       <w:r>
-        <w:t>method: ‘</w:t>
+        <w:t>{ ‘</w:t>
       </w:r>
       <w:proofErr w:type="gramEnd"/>
       <w:r>
-        <w:t>POST’</w:t>
-      </w:r>
-    </w:p>
-    <w:p>
-      <w:r>
-        <w:t>Indicates that this is a POST request, typically used to submit data.</w:t>
-      </w:r>
-    </w:p>
-    <w:p>
-      <w:r>
-        <w:t xml:space="preserve">headers: </w:t>
-      </w:r>
-      <w:proofErr w:type="gramStart"/>
-      <w:r>
-        <w:t>{ ‘</w:t>
-      </w:r>
-      <w:proofErr w:type="gramEnd"/>
-      <w:r>
-        <w:t>Content-Type</w:t>
-      </w:r>
-      <w:proofErr w:type="gramStart"/>
-      <w:r>
-        <w:t>’: ‘</w:t>
-      </w:r>
-      <w:proofErr w:type="gramEnd"/>
-      <w:r>
-        <w:t>application/</w:t>
+        <w:t>Content-Type’: ‘application/</w:t>
       </w:r>
       <w:proofErr w:type="spellStart"/>
       <w:r>
@@ -1589,13 +1564,8 @@
       </w:r>
     </w:p>
     <w:p>
-      <w:proofErr w:type="gramStart"/>
-      <w:r>
-        <w:t>credentials: ‘include</w:t>
-      </w:r>
-      <w:proofErr w:type="gramEnd"/>
-      <w:r>
-        <w:t>’</w:t>
+      <w:r>
+        <w:t>credentials: ‘include’</w:t>
       </w:r>
     </w:p>
     <w:p>
@@ -2220,15 +2190,7 @@
         <w:jc w:val="left"/>
       </w:pPr>
       <w:r>
-        <w:t xml:space="preserve">If a single character has been entered </w:t>
-      </w:r>
-      <w:proofErr w:type="gramStart"/>
-      <w:r>
-        <w:t>in</w:t>
-      </w:r>
-      <w:proofErr w:type="gramEnd"/>
-      <w:r>
-        <w:t xml:space="preserve"> the current input field and the user has not yet reached the sixth field, the focus should automatically move to the next input field. This will make it smoother for users to enter the 6-digit verification code.</w:t>
+        <w:t>If a single character has been entered in the current input field and the user has not yet reached the sixth field, the focus should automatically move to the next input field. This will make it smoother for users to enter the 6-digit verification code.</w:t>
       </w:r>
     </w:p>
     <w:p>
@@ -2430,7 +2392,7 @@
     <w:p>
       <w:pPr>
         <w:rPr>
-          <w:rFonts w:ascii="宋体" w:eastAsia="宋体" w:hAnsi="宋体" w:cs="宋体" w:hint="eastAsia"/>
+          <w:rFonts w:ascii="宋体" w:eastAsia="宋体" w:hAnsi="宋体" w:cs="宋体"/>
           <w:sz w:val="24"/>
         </w:rPr>
       </w:pPr>
@@ -2497,7 +2459,6 @@
     <w:p>
       <w:pPr>
         <w:rPr>
-          <w:rFonts w:hint="eastAsia"/>
           <w:b/>
           <w:bCs/>
           <w:sz w:val="24"/>
@@ -2544,14 +2505,7 @@
           <w:rFonts w:ascii="宋体" w:eastAsia="宋体" w:hAnsi="宋体" w:cs="宋体" w:hint="eastAsia"/>
           <w:sz w:val="24"/>
         </w:rPr>
-        <w:t xml:space="preserve">irst </w:t>
-      </w:r>
-      <w:r>
-        <w:rPr>
-          <w:rFonts w:ascii="宋体" w:eastAsia="宋体" w:hAnsi="宋体" w:cs="宋体" w:hint="eastAsia"/>
-          <w:sz w:val="24"/>
-        </w:rPr>
-        <w:t>section:</w:t>
+        <w:t>irst section:</w:t>
       </w:r>
     </w:p>
     <w:p>
@@ -2629,7 +2583,7 @@
     <w:p>
       <w:pPr>
         <w:rPr>
-          <w:rFonts w:ascii="宋体" w:eastAsia="宋体" w:hAnsi="宋体" w:cs="宋体" w:hint="eastAsia"/>
+          <w:rFonts w:ascii="宋体" w:eastAsia="宋体" w:hAnsi="宋体" w:cs="宋体"/>
           <w:sz w:val="24"/>
         </w:rPr>
       </w:pPr>
@@ -3077,17 +3031,15 @@
         <w:rPr>
           <w:b/>
           <w:bCs/>
-          <w:sz w:val="32"/>
-          <w:szCs w:val="40"/>
-        </w:rPr>
-      </w:pPr>
-      <w:r>
-        <w:rPr>
-          <w:rFonts w:hint="eastAsia"/>
-          <w:b/>
-          <w:bCs/>
-          <w:sz w:val="32"/>
-          <w:szCs w:val="40"/>
+          <w:sz w:val="24"/>
+        </w:rPr>
+      </w:pPr>
+      <w:r>
+        <w:rPr>
+          <w:rFonts w:hint="eastAsia"/>
+          <w:b/>
+          <w:bCs/>
+          <w:sz w:val="24"/>
         </w:rPr>
         <w:t>2.DashboardPage</w:t>
       </w:r>
@@ -3095,7 +3047,7 @@
     <w:p>
       <w:pPr>
         <w:rPr>
-          <w:rFonts w:ascii="宋体" w:eastAsia="宋体" w:hAnsi="宋体" w:cs="宋体"/>
+          <w:rFonts w:ascii="宋体" w:eastAsia="宋体" w:hAnsi="宋体" w:cs="宋体" w:hint="eastAsia"/>
           <w:sz w:val="24"/>
         </w:rPr>
       </w:pPr>
@@ -3128,12 +3080,78 @@
         <w:pStyle w:val="a3"/>
         <w:widowControl/>
       </w:pPr>
+      <w:r>
+        <w:t>2.</w:t>
+      </w:r>
+      <w:r>
+        <w:rPr>
+          <w:rFonts w:hint="eastAsia"/>
+        </w:rPr>
+        <w:t>1</w:t>
+      </w:r>
+      <w:r>
+        <w:t xml:space="preserve"> Front-End Optimization</w:t>
+      </w:r>
     </w:p>
     <w:p>
       <w:pPr>
         <w:pStyle w:val="a3"/>
         <w:widowControl/>
       </w:pPr>
+      <w:r>
+        <w:rPr>
+          <w:rFonts w:hint="eastAsia"/>
+        </w:rPr>
+        <w:t>1.</w:t>
+      </w:r>
+      <w:r>
+        <w:t xml:space="preserve"> </w:t>
+      </w:r>
+      <w:r>
+        <w:rPr>
+          <w:rFonts w:hint="eastAsia"/>
+        </w:rPr>
+        <w:t xml:space="preserve">Redefine page positioning: Shift the page from its original focus as a </w:t>
+      </w:r>
+      <w:r>
+        <w:rPr>
+          <w:rFonts w:hint="eastAsia"/>
+        </w:rPr>
+        <w:t>“</w:t>
+      </w:r>
+      <w:r>
+        <w:rPr>
+          <w:rFonts w:hint="eastAsia"/>
+        </w:rPr>
+        <w:t>homepage navigation hub</w:t>
+      </w:r>
+      <w:r>
+        <w:rPr>
+          <w:rFonts w:hint="eastAsia"/>
+        </w:rPr>
+        <w:t>”</w:t>
+      </w:r>
+      <w:r>
+        <w:rPr>
+          <w:rFonts w:hint="eastAsia"/>
+        </w:rPr>
+        <w:t xml:space="preserve"> to a format more akin to a production dashboard, enabling the homepage to not only display information but also directly support users</w:t>
+      </w:r>
+      <w:r>
+        <w:rPr>
+          <w:rFonts w:hint="eastAsia"/>
+        </w:rPr>
+        <w:t>’</w:t>
+      </w:r>
+      <w:r>
+        <w:rPr>
+          <w:rFonts w:hint="eastAsia"/>
+        </w:rPr>
+        <w:t xml:space="preserve"> key tasks and provide</w:t>
+      </w:r>
+      <w:r>
+        <w:t xml:space="preserve"> entry points for action.</w:t>
+      </w:r>
     </w:p>
     <w:p>
       <w:pPr>
@@ -3141,7 +3159,85 @@
         <w:widowControl/>
       </w:pPr>
       <w:r>
-        <w:t>2.6 Front-End Optimization</w:t>
+        <w:rPr>
+          <w:rFonts w:hint="eastAsia"/>
+        </w:rPr>
+        <w:t>2</w:t>
+      </w:r>
+      <w:r>
+        <w:rPr>
+          <w:lang w:val="en-AU"/>
+        </w:rPr>
+        <w:t xml:space="preserve">. </w:t>
+      </w:r>
+      <w:r>
+        <w:rPr>
+          <w:rFonts w:hint="eastAsia"/>
+        </w:rPr>
+        <w:t>Enhance the homepage</w:t>
+      </w:r>
+      <w:r>
+        <w:rPr>
+          <w:rFonts w:hint="eastAsia"/>
+        </w:rPr>
+        <w:t>’</w:t>
+      </w:r>
+      <w:r>
+        <w:rPr>
+          <w:rFonts w:hint="eastAsia"/>
+        </w:rPr>
+        <w:t xml:space="preserve">s task-oriented design: Move beyond simply displaying welcome messages, data cards, and standard navigation links to place greater emphasis on </w:t>
+      </w:r>
+      <w:r>
+        <w:rPr>
+          <w:rFonts w:hint="eastAsia"/>
+        </w:rPr>
+        <w:t>“</w:t>
+      </w:r>
+      <w:r>
+        <w:rPr>
+          <w:rFonts w:hint="eastAsia"/>
+        </w:rPr>
+        <w:t>what is the most important information right now</w:t>
+      </w:r>
+      <w:r>
+        <w:rPr>
+          <w:rFonts w:hint="eastAsia"/>
+        </w:rPr>
+        <w:t>”</w:t>
+      </w:r>
+      <w:r>
+        <w:rPr>
+          <w:rFonts w:hint="eastAsia"/>
+        </w:rPr>
+        <w:t xml:space="preserve"> and </w:t>
+      </w:r>
+      <w:r>
+        <w:rPr>
+          <w:rFonts w:hint="eastAsia"/>
+        </w:rPr>
+        <w:t>“</w:t>
+      </w:r>
+      <w:r>
+        <w:rPr>
+          <w:rFonts w:hint="eastAsia"/>
+        </w:rPr>
+        <w:t>what should the user do next,</w:t>
+      </w:r>
+      <w:r>
+        <w:rPr>
+          <w:rFonts w:hint="eastAsia"/>
+        </w:rPr>
+        <w:t>”</w:t>
+      </w:r>
+      <w:r>
+        <w:rPr>
+          <w:rFonts w:hint="eastAsia"/>
+        </w:rPr>
+        <w:t xml:space="preserve"> the</w:t>
+      </w:r>
+      <w:r>
+        <w:t>reby increasing the dashboard’s practical value.</w:t>
       </w:r>
     </w:p>
     <w:p>
@@ -3151,15 +3247,15 @@
       </w:pPr>
       <w:r>
         <w:rPr>
-          <w:rFonts w:hint="eastAsia"/>
-        </w:rPr>
-        <w:t>①</w:t>
-      </w:r>
-      <w:r>
-        <w:rPr>
-          <w:rFonts w:hint="eastAsia"/>
-        </w:rPr>
-        <w:t xml:space="preserve"> Redefine page positioning: Shift the page from its original focus as a </w:t>
+          <w:lang w:val="en-AU"/>
+        </w:rPr>
+        <w:t xml:space="preserve">3. </w:t>
+      </w:r>
+      <w:r>
+        <w:rPr>
+          <w:rFonts w:hint="eastAsia"/>
+        </w:rPr>
+        <w:t xml:space="preserve">Refine Role Hierarchy Logic: Refine the page roles from the original broad distinction between </w:t>
       </w:r>
       <w:r>
         <w:rPr>
@@ -3171,7 +3267,7 @@
         <w:rPr>
           <w:rFonts w:hint="eastAsia"/>
         </w:rPr>
-        <w:t>homepage navigation hub</w:t>
+        <w:t>admin</w:t>
       </w:r>
       <w:r>
         <w:rPr>
@@ -3183,24 +3279,34 @@
         <w:rPr>
           <w:rFonts w:hint="eastAsia"/>
         </w:rPr>
-        <w:t xml:space="preserve"> to a format more akin to a production dashboard, enabling the homepage to not only display information but also directly support users</w:t>
-      </w:r>
-      <w:proofErr w:type="gramStart"/>
-      <w:r>
-        <w:rPr>
-          <w:rFonts w:hint="eastAsia"/>
-        </w:rPr>
-        <w:t>’</w:t>
-      </w:r>
-      <w:proofErr w:type="gramEnd"/>
-      <w:r>
-        <w:rPr>
-          <w:rFonts w:hint="eastAsia"/>
-        </w:rPr>
-        <w:t xml:space="preserve"> key tasks and provide</w:t>
-      </w:r>
-      <w:r>
-        <w:t xml:space="preserve"> entry points for action.</w:t>
+        <w:t xml:space="preserve"> and </w:t>
+      </w:r>
+      <w:r>
+        <w:rPr>
+          <w:rFonts w:hint="eastAsia"/>
+        </w:rPr>
+        <w:t>“</w:t>
+      </w:r>
+      <w:r>
+        <w:rPr>
+          <w:rFonts w:hint="eastAsia"/>
+        </w:rPr>
+        <w:t>non-admin</w:t>
+      </w:r>
+      <w:r>
+        <w:rPr>
+          <w:rFonts w:hint="eastAsia"/>
+        </w:rPr>
+        <w:t>”</w:t>
+      </w:r>
+      <w:r>
+        <w:rPr>
+          <w:rFonts w:hint="eastAsia"/>
+        </w:rPr>
+        <w:t xml:space="preserve"> into three categories: student, teacher, and admin. This ensures that the content focus, functional entry points, and information struc</w:t>
+      </w:r>
+      <w:r>
+        <w:t>ture for users of different roles better align with real-world usage scenarios.</w:t>
       </w:r>
     </w:p>
     <w:p>
@@ -3210,88 +3316,18 @@
       </w:pPr>
       <w:r>
         <w:rPr>
-          <w:rFonts w:hint="eastAsia"/>
-        </w:rPr>
-        <w:t>②</w:t>
-      </w:r>
-      <w:r>
-        <w:rPr>
-          <w:rFonts w:hint="eastAsia"/>
-        </w:rPr>
-        <w:t xml:space="preserve"> Enhance the homepage</w:t>
-      </w:r>
-      <w:proofErr w:type="gramStart"/>
-      <w:r>
-        <w:rPr>
-          <w:rFonts w:hint="eastAsia"/>
-        </w:rPr>
-        <w:t>’</w:t>
-      </w:r>
-      <w:proofErr w:type="gramEnd"/>
-      <w:r>
-        <w:rPr>
-          <w:rFonts w:hint="eastAsia"/>
-        </w:rPr>
-        <w:t xml:space="preserve">s task-oriented design: Move beyond simply displaying welcome messages, data cards, and standard navigation links to place greater emphasis on </w:t>
-      </w:r>
-      <w:r>
-        <w:rPr>
-          <w:rFonts w:hint="eastAsia"/>
-        </w:rPr>
-        <w:t>“</w:t>
-      </w:r>
-      <w:r>
-        <w:rPr>
-          <w:rFonts w:hint="eastAsia"/>
-        </w:rPr>
-        <w:t>what is the most important information right now</w:t>
-      </w:r>
-      <w:r>
-        <w:rPr>
-          <w:rFonts w:hint="eastAsia"/>
-        </w:rPr>
-        <w:t>”</w:t>
-      </w:r>
-      <w:r>
-        <w:rPr>
-          <w:rFonts w:hint="eastAsia"/>
-        </w:rPr>
-        <w:t xml:space="preserve"> and </w:t>
-      </w:r>
-      <w:r>
-        <w:rPr>
-          <w:rFonts w:hint="eastAsia"/>
-        </w:rPr>
-        <w:t>“</w:t>
-      </w:r>
-      <w:r>
-        <w:rPr>
-          <w:rFonts w:hint="eastAsia"/>
-        </w:rPr>
-        <w:t>what should the user do next,</w:t>
-      </w:r>
-      <w:r>
-        <w:rPr>
-          <w:rFonts w:hint="eastAsia"/>
-        </w:rPr>
-        <w:t>”</w:t>
-      </w:r>
-      <w:r>
-        <w:rPr>
-          <w:rFonts w:hint="eastAsia"/>
-        </w:rPr>
-        <w:t xml:space="preserve"> the</w:t>
-      </w:r>
-      <w:r>
-        <w:t>reby increasing the dashboard</w:t>
-      </w:r>
-      <w:proofErr w:type="gramStart"/>
-      <w:r>
-        <w:t>’</w:t>
-      </w:r>
-      <w:proofErr w:type="gramEnd"/>
-      <w:r>
-        <w:t>s practical value.</w:t>
+          <w:lang w:val="en-AU"/>
+        </w:rPr>
+        <w:t xml:space="preserve">4. </w:t>
+      </w:r>
+      <w:r>
+        <w:rPr>
+          <w:rFonts w:hint="eastAsia"/>
+        </w:rPr>
+        <w:t>Optimizing top-level user context display: We have added a more comprehensive display of user information in the top area. In addition to the username and track, we have included role information and implemented a unified fallback mechanism for all displ</w:t>
+      </w:r>
+      <w:r>
+        <w:t>ayed fields to ensure the page displays correctly even when user information is incomplete.</w:t>
       </w:r>
     </w:p>
     <w:p>
@@ -3301,66 +3337,31 @@
       </w:pPr>
       <w:r>
         <w:rPr>
-          <w:rFonts w:hint="eastAsia"/>
-        </w:rPr>
-        <w:t>③</w:t>
-      </w:r>
-      <w:r>
-        <w:rPr>
-          <w:rFonts w:hint="eastAsia"/>
-        </w:rPr>
-        <w:t xml:space="preserve"> Refine Role Hierarchy Logic: Refine the page roles from the original broad distinction between </w:t>
-      </w:r>
-      <w:r>
-        <w:rPr>
-          <w:rFonts w:hint="eastAsia"/>
-        </w:rPr>
-        <w:t>“</w:t>
-      </w:r>
-      <w:r>
-        <w:rPr>
-          <w:rFonts w:hint="eastAsia"/>
-        </w:rPr>
-        <w:t>admin</w:t>
-      </w:r>
-      <w:r>
-        <w:rPr>
-          <w:rFonts w:hint="eastAsia"/>
-        </w:rPr>
-        <w:t>”</w:t>
-      </w:r>
-      <w:r>
-        <w:rPr>
-          <w:rFonts w:hint="eastAsia"/>
-        </w:rPr>
-        <w:t xml:space="preserve"> and </w:t>
-      </w:r>
-      <w:r>
-        <w:rPr>
-          <w:rFonts w:hint="eastAsia"/>
-        </w:rPr>
-        <w:t>“</w:t>
-      </w:r>
-      <w:r>
-        <w:rPr>
-          <w:rFonts w:hint="eastAsia"/>
-        </w:rPr>
-        <w:t>non-admin</w:t>
-      </w:r>
-      <w:r>
-        <w:rPr>
-          <w:rFonts w:hint="eastAsia"/>
-        </w:rPr>
-        <w:t>”</w:t>
-      </w:r>
-      <w:r>
-        <w:rPr>
-          <w:rFonts w:hint="eastAsia"/>
-        </w:rPr>
-        <w:t xml:space="preserve"> into three categories: student, teacher, and admin. This ensures that the content focus, functional entry points, and information struc</w:t>
-      </w:r>
-      <w:r>
-        <w:t>ture for users of different roles better align with real-world usage scenarios.</w:t>
+          <w:lang w:val="en-AU"/>
+        </w:rPr>
+        <w:lastRenderedPageBreak/>
+        <w:t xml:space="preserve">5. </w:t>
+      </w:r>
+      <w:r>
+        <w:rPr>
+          <w:rFonts w:hint="eastAsia"/>
+        </w:rPr>
+        <w:t>Reworked the content logic of overview cards: Summary widgets are now dynamically generated based on role. Different users see different key metrics</w:t>
+      </w:r>
+      <w:r>
+        <w:rPr>
+          <w:rFonts w:hint="eastAsia"/>
+        </w:rPr>
+        <w:t>—</w:t>
+      </w:r>
+      <w:r>
+        <w:rPr>
+          <w:rFonts w:hint="eastAsia"/>
+        </w:rPr>
+        <w:t>for example, students focus on groups, events, and resources; teachers focus on mentoring sessions; and a</w:t>
+      </w:r>
+      <w:r>
+        <w:t>dministrators focus on active groups, pending matches, and announcements.</w:t>
       </w:r>
     </w:p>
     <w:p>
@@ -3370,19 +3371,18 @@
       </w:pPr>
       <w:r>
         <w:rPr>
-          <w:rFonts w:hint="eastAsia"/>
-        </w:rPr>
-        <w:lastRenderedPageBreak/>
-        <w:t>④</w:t>
-      </w:r>
-      <w:r>
-        <w:rPr>
-          <w:rFonts w:hint="eastAsia"/>
-        </w:rPr>
-        <w:t xml:space="preserve"> Optimizing top-level user context display: We have added a more comprehensive display of user information in the top area. In addition to the username and track, we have included role information and implemented a unified fallback mechanism for all displ</w:t>
-      </w:r>
-      <w:r>
-        <w:t>ayed fields to ensure the page displays correctly even when user information is incomplete.</w:t>
+          <w:lang w:val="en-AU"/>
+        </w:rPr>
+        <w:t xml:space="preserve">6. </w:t>
+      </w:r>
+      <w:r>
+        <w:rPr>
+          <w:rFonts w:hint="eastAsia"/>
+        </w:rPr>
+        <w:t>Enhanced usability of the overview card: The top overview card now serves not only as an information display but also as a clear entry point to content, allowing users to navigate directly from key metrics to relevant modules, thereby improving operation</w:t>
+      </w:r>
+      <w:r>
+        <w:t>al efficiency.</w:t>
       </w:r>
     </w:p>
     <w:p>
@@ -3391,31 +3391,28 @@
         <w:widowControl/>
       </w:pPr>
       <w:r>
-        <w:rPr>
-          <w:rFonts w:hint="eastAsia"/>
-        </w:rPr>
-        <w:t xml:space="preserve">⑤　</w:t>
-      </w:r>
-      <w:r>
-        <w:rPr>
-          <w:rFonts w:hint="eastAsia"/>
-        </w:rPr>
-        <w:t>Reworked the content logic of overview cards: Summary widgets are now dynamically generated based on role. Different users see different key metrics</w:t>
-      </w:r>
-      <w:r>
-        <w:rPr>
-          <w:rFonts w:hint="eastAsia"/>
-        </w:rPr>
-        <w:t>—</w:t>
-      </w:r>
-      <w:r>
-        <w:rPr>
-          <w:rFonts w:hint="eastAsia"/>
-        </w:rPr>
-        <w:t>for example, students focus on groups, events, and resources; teachers focus on mentoring sessions; and a</w:t>
-      </w:r>
-      <w:r>
-        <w:t>dministrators focus on active groups, pending matches, and announcements.</w:t>
+        <w:t xml:space="preserve">7. </w:t>
+      </w:r>
+      <w:r>
+        <w:rPr>
+          <w:rFonts w:hint="eastAsia"/>
+        </w:rPr>
+        <w:t>Strengthened visual hierarchy of the homepage welcome area: The hero section received an overall visual enhancement, including more reasonable padding, title hierarchy, soft highlights, and subtle background decorations, making the page</w:t>
+      </w:r>
+      <w:r>
+        <w:rPr>
+          <w:rFonts w:hint="eastAsia"/>
+        </w:rPr>
+        <w:t>’</w:t>
+      </w:r>
+      <w:r>
+        <w:rPr>
+          <w:rFonts w:hint="eastAsia"/>
+        </w:rPr>
+        <w:t>s first screen mo</w:t>
+      </w:r>
+      <w:r>
+        <w:t>re product-oriented and recognizable.</w:t>
       </w:r>
     </w:p>
     <w:p>
@@ -3425,18 +3422,29 @@
       </w:pPr>
       <w:r>
         <w:rPr>
-          <w:rFonts w:hint="eastAsia"/>
-        </w:rPr>
-        <w:t xml:space="preserve">⑥　</w:t>
-      </w:r>
-      <w:r>
-        <w:rPr>
-          <w:rFonts w:hint="eastAsia"/>
-        </w:rPr>
-        <w:t>Enhanced usability of the overview card: The top overview card now serves not only as an information display but also as a clear entry point to content, allowing users to navigate directly from key metrics to relevant modules, thereby improving operation</w:t>
-      </w:r>
-      <w:r>
-        <w:t>al efficiency.</w:t>
+          <w:lang w:val="en-AU"/>
+        </w:rPr>
+        <w:t xml:space="preserve">8. </w:t>
+      </w:r>
+      <w:r>
+        <w:rPr>
+          <w:rFonts w:hint="eastAsia"/>
+        </w:rPr>
+        <w:t xml:space="preserve">Optimize the </w:t>
+      </w:r>
+      <w:proofErr w:type="gramStart"/>
+      <w:r>
+        <w:rPr>
+          <w:rFonts w:hint="eastAsia"/>
+        </w:rPr>
+        <w:t>first-screen</w:t>
+      </w:r>
+      <w:proofErr w:type="gramEnd"/>
+      <w:r>
+        <w:rPr>
+          <w:rFonts w:hint="eastAsia"/>
+        </w:rPr>
+        <w:t xml:space="preserve"> reading experience: Clarify the hierarchy between welcome messages, supplementary notes, and status information so users can quickly understand their current role, status, and key tasks upon entering the page.</w:t>
       </w:r>
     </w:p>
     <w:p>
@@ -3446,137 +3454,113 @@
       </w:pPr>
       <w:r>
         <w:rPr>
-          <w:rFonts w:hint="eastAsia"/>
-        </w:rPr>
-        <w:t xml:space="preserve">⑦　</w:t>
-      </w:r>
-      <w:r>
-        <w:rPr>
-          <w:rFonts w:hint="eastAsia"/>
-        </w:rPr>
-        <w:t>Strengthened visual hierarchy of the homepage welcome area: The hero section received an overall visual enhancement, including more reasonable padding, title hierarchy, soft highlights, and subtle background decorations, making the page</w:t>
-      </w:r>
-      <w:proofErr w:type="gramStart"/>
-      <w:r>
-        <w:rPr>
-          <w:rFonts w:hint="eastAsia"/>
-        </w:rPr>
-        <w:t>’</w:t>
-      </w:r>
-      <w:proofErr w:type="gramEnd"/>
-      <w:r>
-        <w:rPr>
-          <w:rFonts w:hint="eastAsia"/>
-        </w:rPr>
-        <w:t>s first screen mo</w:t>
-      </w:r>
-      <w:r>
-        <w:t>re product-oriented and recognizable.</w:t>
+          <w:lang w:val="en-AU"/>
+        </w:rPr>
+        <w:t xml:space="preserve">9. </w:t>
+      </w:r>
+      <w:r>
+        <w:rPr>
+          <w:rFonts w:hint="eastAsia"/>
+        </w:rPr>
+        <w:t xml:space="preserve">Enhance the visual impact of data cards: Standard data cards have been optimized into more prominent </w:t>
+      </w:r>
+      <w:r>
+        <w:rPr>
+          <w:rFonts w:hint="eastAsia"/>
+        </w:rPr>
+        <w:t>“</w:t>
+      </w:r>
+      <w:r>
+        <w:rPr>
+          <w:rFonts w:hint="eastAsia"/>
+        </w:rPr>
+        <w:t>clickable metric modules,</w:t>
+      </w:r>
+      <w:r>
+        <w:rPr>
+          <w:rFonts w:hint="eastAsia"/>
+        </w:rPr>
+        <w:t>”</w:t>
+      </w:r>
+      <w:r>
+        <w:rPr>
+          <w:rFonts w:hint="eastAsia"/>
+        </w:rPr>
+        <w:t xml:space="preserve"> emphasizing numerical displays to help users quickly scan for key figures and corresponding explanations.</w:t>
       </w:r>
     </w:p>
     <w:p>
       <w:pPr>
         <w:pStyle w:val="a3"/>
         <w:widowControl/>
-        <w:rPr>
-          <w:rFonts w:hint="eastAsia"/>
-        </w:rPr>
-      </w:pPr>
-      <w:r>
-        <w:rPr>
-          <w:rFonts w:hint="eastAsia"/>
-        </w:rPr>
-        <w:t>⑧</w:t>
-      </w:r>
-      <w:r>
-        <w:rPr>
-          <w:rFonts w:hint="eastAsia"/>
-        </w:rPr>
-        <w:t xml:space="preserve"> Optimize the first-screen reading experience: Clarify the hierarchy between welcome messages, supplementary notes, and status information so users can quickly understand their current role, status, and key tasks upon entering the page.</w:t>
+      </w:pPr>
+      <w:r>
+        <w:rPr>
+          <w:lang w:val="en-AU"/>
+        </w:rPr>
+        <w:t xml:space="preserve">10. </w:t>
+      </w:r>
+      <w:r>
+        <w:rPr>
+          <w:rFonts w:hint="eastAsia"/>
+        </w:rPr>
+        <w:t xml:space="preserve">Optimize card interaction feedback: Added more natural hover effects, shadow changes, and background feedback to make cards feel more responsive during mouse interactions, further reinforcing the perception that </w:t>
+      </w:r>
+      <w:r>
+        <w:rPr>
+          <w:rFonts w:hint="eastAsia"/>
+        </w:rPr>
+        <w:t>“</w:t>
+      </w:r>
+      <w:r>
+        <w:rPr>
+          <w:rFonts w:hint="eastAsia"/>
+        </w:rPr>
+        <w:t>this is an actionable area.</w:t>
+      </w:r>
+      <w:r>
+        <w:rPr>
+          <w:rFonts w:hint="eastAsia"/>
+        </w:rPr>
+        <w:t>”</w:t>
       </w:r>
     </w:p>
     <w:p>
       <w:pPr>
         <w:pStyle w:val="a3"/>
         <w:widowControl/>
-        <w:rPr>
-          <w:rFonts w:hint="eastAsia"/>
-        </w:rPr>
-      </w:pPr>
-      <w:r>
-        <w:rPr>
-          <w:rFonts w:hint="eastAsia"/>
-        </w:rPr>
-        <w:t>⑨</w:t>
-      </w:r>
-      <w:r>
-        <w:rPr>
-          <w:rFonts w:hint="eastAsia"/>
-        </w:rPr>
-        <w:t xml:space="preserve"> Enhance the visual impact of data cards: Standard data cards have been optimized into more prominent </w:t>
-      </w:r>
-      <w:r>
-        <w:rPr>
-          <w:rFonts w:hint="eastAsia"/>
-        </w:rPr>
-        <w:t>“</w:t>
-      </w:r>
-      <w:r>
-        <w:rPr>
-          <w:rFonts w:hint="eastAsia"/>
-        </w:rPr>
-        <w:t>clickable metric modules,</w:t>
-      </w:r>
-      <w:r>
-        <w:rPr>
-          <w:rFonts w:hint="eastAsia"/>
-        </w:rPr>
-        <w:t>”</w:t>
-      </w:r>
-      <w:r>
-        <w:rPr>
-          <w:rFonts w:hint="eastAsia"/>
-        </w:rPr>
-        <w:t xml:space="preserve"> emphasizing numerical displays to help users quickly scan for key figures and corresponding explanations.</w:t>
+      </w:pPr>
+      <w:r>
+        <w:t>11</w:t>
+      </w:r>
+      <w:r>
+        <w:t xml:space="preserve">. </w:t>
+      </w:r>
+      <w:r>
+        <w:t xml:space="preserve">Unify card styling details: Added subtle borders, rounded corners, appropriate padding, and consistent white space to various modules, improving overall interface consistency and making the dashboard look </w:t>
+      </w:r>
+      <w:proofErr w:type="gramStart"/>
+      <w:r>
+        <w:t>more complete and professional</w:t>
+      </w:r>
+      <w:proofErr w:type="gramEnd"/>
+      <w:r>
+        <w:t>.</w:t>
       </w:r>
     </w:p>
     <w:p>
       <w:pPr>
         <w:pStyle w:val="a3"/>
         <w:widowControl/>
-        <w:rPr>
-          <w:rFonts w:hint="eastAsia"/>
-        </w:rPr>
-      </w:pPr>
-      <w:r>
-        <w:rPr>
-          <w:rFonts w:hint="eastAsia"/>
-        </w:rPr>
-        <w:t>⑩</w:t>
-      </w:r>
-      <w:r>
-        <w:rPr>
-          <w:rFonts w:hint="eastAsia"/>
-        </w:rPr>
-        <w:t xml:space="preserve"> Optimize card interaction feedback: Added more natural hover effects, shadow changes, and background feedback to make cards feel more responsive during mouse interactions, further reinforcing the perception that </w:t>
-      </w:r>
-      <w:r>
-        <w:rPr>
-          <w:rFonts w:hint="eastAsia"/>
-        </w:rPr>
-        <w:t>“</w:t>
-      </w:r>
-      <w:r>
-        <w:rPr>
-          <w:rFonts w:hint="eastAsia"/>
-        </w:rPr>
-        <w:t>this is an actionable area.</w:t>
-      </w:r>
-      <w:r>
-        <w:rPr>
-          <w:rFonts w:hint="eastAsia"/>
-        </w:rPr>
-        <w:t>”</w:t>
+      </w:pPr>
+      <w:r>
+        <w:t>12.</w:t>
+      </w:r>
+      <w:r>
+        <w:t xml:space="preserve"> </w:t>
+      </w:r>
+      <w:r>
+        <w:t>Improved information scanning efficiency: By implementing a clearer three-tier structure of headings, values, and descriptions, we’ve reduced the cluttered feel of information and enabled users to locate key modules and critical content more quickly.</w:t>
       </w:r>
     </w:p>
     <w:p>
@@ -3585,15 +3569,13 @@
         <w:widowControl/>
       </w:pPr>
       <w:r>
-        <w:t xml:space="preserve">11 Unify card styling details: Added subtle borders, rounded corners, appropriate padding, and consistent white space to various modules, improving overall interface consistency and making the dashboard look </w:t>
-      </w:r>
-      <w:proofErr w:type="gramStart"/>
-      <w:r>
-        <w:t>more complete and professional</w:t>
-      </w:r>
-      <w:proofErr w:type="gramEnd"/>
-      <w:r>
-        <w:t>.</w:t>
+        <w:t>13.</w:t>
+      </w:r>
+      <w:r>
+        <w:t xml:space="preserve"> </w:t>
+      </w:r>
+      <w:r>
+        <w:t>Added background image switching: We’ve introduced the ability to switch background images, enhancing page personalization and visual richness while making the dashboard more polished in terms of product presentation and user experience.</w:t>
       </w:r>
     </w:p>
     <w:p>
@@ -3602,7 +3584,23 @@
         <w:widowControl/>
       </w:pPr>
       <w:r>
-        <w:t>12. Improved information scanning efficiency: By implementing a clearer three-tier structure of headings, values, and descriptions, we’ve reduced the cluttered feel of information and enabled users to locate key modules and critical content more quickly.</w:t>
+        <w:rPr>
+          <w:rFonts w:hint="eastAsia"/>
+        </w:rPr>
+        <w:lastRenderedPageBreak/>
+        <w:t>14. Enhance page stability and fault tolerance: Implemented more comprehensive fallback handling for displayed data to prevent blank pages,</w:t>
+      </w:r>
+      <w:r>
+        <w:rPr>
+          <w:rFonts w:hint="eastAsia"/>
+        </w:rPr>
+        <w:t>混乱</w:t>
+      </w:r>
+      <w:r>
+        <w:rPr>
+          <w:rFonts w:hint="eastAsia"/>
+        </w:rPr>
+        <w:t>, or display anomalies caused by missing user fields or incomplete API data.</w:t>
       </w:r>
     </w:p>
     <w:p>
@@ -3611,46 +3609,6 @@
         <w:widowControl/>
       </w:pPr>
       <w:r>
-        <w:lastRenderedPageBreak/>
-        <w:t>13. Added background image switching: We’ve introduced the ability to switch background images, enhancing page personalization and visual richness while making the dashboard more polished in terms of product presentation and user experience.</w:t>
-      </w:r>
-    </w:p>
-    <w:p>
-      <w:pPr>
-        <w:pStyle w:val="a3"/>
-        <w:widowControl/>
-        <w:rPr>
-          <w:rFonts w:hint="eastAsia"/>
-        </w:rPr>
-      </w:pPr>
-      <w:r>
-        <w:rPr>
-          <w:rFonts w:hint="eastAsia"/>
-        </w:rPr>
-        <w:t>14. Enhance page stability and fault tolerance: Implemented more comprehensive fallback handling for displayed data to prevent blank pages,</w:t>
-      </w:r>
-      <w:r>
-        <w:rPr>
-          <w:rFonts w:hint="eastAsia"/>
-        </w:rPr>
-        <w:t>混乱</w:t>
-      </w:r>
-      <w:r>
-        <w:rPr>
-          <w:rFonts w:hint="eastAsia"/>
-        </w:rPr>
-        <w:t>, or display anomalies caused by missing user fields or incomplete API data.</w:t>
-      </w:r>
-    </w:p>
-    <w:p>
-      <w:pPr>
-        <w:pStyle w:val="a3"/>
-        <w:widowControl/>
-        <w:rPr>
-          <w:rFonts w:hint="eastAsia"/>
-        </w:rPr>
-      </w:pPr>
-      <w:r>
         <w:t>15. Make the dashboard more closely resemble a real mentoring platform scenario: After overall optimization, the page is no longer just a generic management homepage but aligns more closely with the actual business logic of a mentoring platform, reflecting the real concerns and operational paths of different roles within the platform.</w:t>
       </w:r>
     </w:p>
@@ -3661,6 +3619,39 @@
           <w:sz w:val="24"/>
         </w:rPr>
       </w:pPr>
+    </w:p>
+    <w:p>
+      <w:pPr>
+        <w:rPr>
+          <w:rFonts w:cs="Times New Roman" w:hint="eastAsia"/>
+          <w:b/>
+          <w:bCs/>
+          <w:kern w:val="0"/>
+          <w:sz w:val="24"/>
+        </w:rPr>
+      </w:pPr>
+      <w:r>
+        <w:rPr>
+          <w:rFonts w:cs="Times New Roman"/>
+          <w:b/>
+          <w:bCs/>
+          <w:kern w:val="0"/>
+          <w:sz w:val="24"/>
+        </w:rPr>
+        <w:t xml:space="preserve">3. </w:t>
+      </w:r>
+      <w:proofErr w:type="spellStart"/>
+      <w:r>
+        <w:rPr>
+          <w:rFonts w:cs="Times New Roman"/>
+          <w:b/>
+          <w:bCs/>
+          <w:kern w:val="0"/>
+          <w:sz w:val="24"/>
+        </w:rPr>
+        <w:t>AppPage</w:t>
+      </w:r>
+      <w:proofErr w:type="spellEnd"/>
     </w:p>
     <w:p>
       <w:pPr>
@@ -3676,18 +3667,24 @@
           <w:kern w:val="0"/>
           <w:sz w:val="24"/>
         </w:rPr>
-        <w:t xml:space="preserve">3. </w:t>
-      </w:r>
-      <w:proofErr w:type="spellStart"/>
+        <w:t>3.</w:t>
+      </w:r>
+      <w:r>
+        <w:rPr>
+          <w:rFonts w:cs="Times New Roman" w:hint="eastAsia"/>
+          <w:kern w:val="0"/>
+          <w:sz w:val="24"/>
+        </w:rPr>
+        <w:t>1</w:t>
+      </w:r>
       <w:r>
         <w:rPr>
           <w:rFonts w:cs="Times New Roman"/>
           <w:kern w:val="0"/>
           <w:sz w:val="24"/>
         </w:rPr>
-        <w:t>AppPage</w:t>
-      </w:r>
-      <w:proofErr w:type="spellEnd"/>
+        <w:t xml:space="preserve"> Frontend Optimization</w:t>
+      </w:r>
     </w:p>
     <w:p>
       <w:pPr>
@@ -3697,83 +3694,81 @@
           <w:sz w:val="24"/>
         </w:rPr>
       </w:pPr>
-    </w:p>
-    <w:p>
-      <w:pPr>
+      <w:r>
         <w:rPr>
           <w:rFonts w:cs="Times New Roman"/>
           <w:kern w:val="0"/>
           <w:sz w:val="24"/>
         </w:rPr>
-      </w:pPr>
+        <w:t xml:space="preserve">1. This update primarily adjusted the layout of the left-side navigation in </w:t>
+      </w:r>
+      <w:proofErr w:type="spellStart"/>
       <w:r>
         <w:rPr>
           <w:rFonts w:cs="Times New Roman"/>
           <w:kern w:val="0"/>
           <w:sz w:val="24"/>
         </w:rPr>
-        <w:t>3.6 Frontend Optimization</w:t>
-      </w:r>
-    </w:p>
-    <w:p>
-      <w:pPr>
+        <w:t>App.vue</w:t>
+      </w:r>
+      <w:proofErr w:type="spellEnd"/>
+      <w:r>
         <w:rPr>
           <w:rFonts w:cs="Times New Roman"/>
           <w:kern w:val="0"/>
           <w:sz w:val="24"/>
         </w:rPr>
-      </w:pPr>
-      <w:r>
+        <w:t>, ensuring it remains fixed below the header when scrolling on desktop devices, is not obscured by the top bar, and can scroll independently when content is too long.</w:t>
+      </w:r>
+    </w:p>
+    <w:p>
+      <w:pPr>
         <w:rPr>
           <w:rFonts w:cs="Times New Roman"/>
           <w:kern w:val="0"/>
           <w:sz w:val="24"/>
         </w:rPr>
-        <w:t xml:space="preserve">1.    This update primarily adjusted the layout of the left-side navigation in </w:t>
-      </w:r>
-      <w:proofErr w:type="spellStart"/>
+      </w:pPr>
       <w:r>
         <w:rPr>
           <w:rFonts w:cs="Times New Roman"/>
           <w:kern w:val="0"/>
           <w:sz w:val="24"/>
         </w:rPr>
-        <w:t>App.vue</w:t>
-      </w:r>
-      <w:proofErr w:type="spellEnd"/>
+        <w:t>2.</w:t>
+      </w:r>
       <w:r>
         <w:rPr>
           <w:rFonts w:cs="Times New Roman"/>
           <w:kern w:val="0"/>
           <w:sz w:val="24"/>
         </w:rPr>
-        <w:t>, ensuring it remains fixed below the header when scrolling on desktop devices, is not obscured by the top bar, and can scroll independently when content is too long.</w:t>
-      </w:r>
-    </w:p>
-    <w:p>
-      <w:pPr>
+        <w:t xml:space="preserve"> </w:t>
+      </w:r>
+      <w:r>
         <w:rPr>
           <w:rFonts w:cs="Times New Roman"/>
           <w:kern w:val="0"/>
           <w:sz w:val="24"/>
         </w:rPr>
-      </w:pPr>
-      <w:r>
+        <w:t>Optimized the interaction logic for the control panel in the user avatar area. Previously, the panel could only be closed by clicking the close button; now, it can be closed automatically by clicking in the blank area, using the Esc key, or when switching routes.</w:t>
+      </w:r>
+    </w:p>
+    <w:p>
+      <w:pPr>
         <w:rPr>
           <w:rFonts w:cs="Times New Roman"/>
           <w:kern w:val="0"/>
           <w:sz w:val="24"/>
         </w:rPr>
-        <w:t>2.</w:t>
-      </w:r>
+      </w:pPr>
       <w:r>
         <w:rPr>
           <w:rFonts w:cs="Times New Roman"/>
           <w:kern w:val="0"/>
           <w:sz w:val="24"/>
         </w:rPr>
-        <w:tab/>
-        <w:t>Optimized the interaction logic for the control panel in the user avatar area. Previously, the panel could only be closed by clicking the close button; now, it can be closed automatically by clicking in the blank area, using the Esc key, or when switching routes.</w:t>
+        <w:t>3. A calendar has been added below the left-side navigation bar. Administrators can edit events in the calendar, and all users can view the updated results, as well as holidays and daily reminders.</w:t>
       </w:r>
     </w:p>
     <w:p>
@@ -3784,13 +3779,35 @@
           <w:sz w:val="24"/>
         </w:rPr>
       </w:pPr>
-      <w:r>
+    </w:p>
+    <w:p>
+      <w:pPr>
         <w:rPr>
           <w:rFonts w:cs="Times New Roman"/>
           <w:kern w:val="0"/>
           <w:sz w:val="24"/>
         </w:rPr>
-        <w:t>3.    A calendar has been added below the left-side navigation bar. Administrators can edit events in the calendar, and all users can view the updated results, as well as holidays and daily reminders.</w:t>
+      </w:pPr>
+    </w:p>
+    <w:p>
+      <w:pPr>
+        <w:rPr>
+          <w:rFonts w:cs="Times New Roman"/>
+          <w:b/>
+          <w:bCs/>
+          <w:kern w:val="0"/>
+          <w:sz w:val="24"/>
+        </w:rPr>
+      </w:pPr>
+      <w:r>
+        <w:rPr>
+          <w:rFonts w:cs="Times New Roman"/>
+          <w:b/>
+          <w:bCs/>
+          <w:kern w:val="0"/>
+          <w:sz w:val="24"/>
+        </w:rPr>
+        <w:t>4. Router</w:t>
       </w:r>
     </w:p>
     <w:p>
@@ -3801,91 +3818,245 @@
           <w:sz w:val="24"/>
         </w:rPr>
       </w:pPr>
-    </w:p>
-    <w:p>
-      <w:pPr>
+      <w:r>
         <w:rPr>
           <w:rFonts w:cs="Times New Roman"/>
           <w:kern w:val="0"/>
           <w:sz w:val="24"/>
         </w:rPr>
-      </w:pPr>
-    </w:p>
-    <w:p>
-      <w:pPr>
+        <w:t>4.</w:t>
+      </w:r>
+      <w:r>
+        <w:rPr>
+          <w:rFonts w:cs="Times New Roman" w:hint="eastAsia"/>
+          <w:kern w:val="0"/>
+          <w:sz w:val="24"/>
+        </w:rPr>
+        <w:t>1</w:t>
+      </w:r>
+      <w:r>
         <w:rPr>
           <w:rFonts w:cs="Times New Roman"/>
           <w:kern w:val="0"/>
           <w:sz w:val="24"/>
         </w:rPr>
-      </w:pPr>
-      <w:r>
+        <w:t xml:space="preserve"> Frontend Optimization</w:t>
+      </w:r>
+    </w:p>
+    <w:p>
+      <w:pPr>
         <w:rPr>
           <w:rFonts w:cs="Times New Roman"/>
           <w:kern w:val="0"/>
           <w:sz w:val="24"/>
         </w:rPr>
-        <w:t>4. Router</w:t>
-      </w:r>
-    </w:p>
-    <w:p>
-      <w:pPr>
+      </w:pPr>
+      <w:r>
         <w:rPr>
           <w:rFonts w:cs="Times New Roman"/>
           <w:kern w:val="0"/>
           <w:sz w:val="24"/>
         </w:rPr>
-      </w:pPr>
+        <w:t xml:space="preserve">1. A configuration error related to the `group` parameter in router page redirects previously caused the dashboard to display modified content upon redirection; this issue has been </w:t>
+      </w:r>
       <w:r>
         <w:rPr>
           <w:rFonts w:cs="Times New Roman"/>
           <w:kern w:val="0"/>
           <w:sz w:val="24"/>
         </w:rPr>
-        <w:t>4.6 Frontend Optimization</w:t>
-      </w:r>
-    </w:p>
-    <w:p>
-      <w:pPr>
+        <w:t>resolved and</w:t>
+      </w:r>
+      <w:r>
         <w:rPr>
           <w:rFonts w:cs="Times New Roman"/>
           <w:kern w:val="0"/>
           <w:sz w:val="24"/>
         </w:rPr>
-      </w:pPr>
+        <w:t xml:space="preserve"> redirects now function correctly.</w:t>
+      </w:r>
       <w:r>
         <w:rPr>
           <w:rFonts w:cs="Times New Roman"/>
           <w:kern w:val="0"/>
           <w:sz w:val="24"/>
         </w:rPr>
-        <w:t xml:space="preserve">1. A configuration error related to the `group` parameter in router page redirects previously caused the dashboard to display modified content upon redirection; this issue has been </w:t>
-      </w:r>
-      <w:proofErr w:type="gramStart"/>
-      <w:r>
+        <w:tab/>
+      </w:r>
+    </w:p>
+    <w:p>
+      <w:pPr>
         <w:rPr>
           <w:rFonts w:cs="Times New Roman"/>
           <w:kern w:val="0"/>
           <w:sz w:val="24"/>
-        </w:rPr>
-        <w:t>resolved, and</w:t>
-      </w:r>
-      <w:proofErr w:type="gramEnd"/>
-      <w:r>
+          <w:lang w:val="en-AU"/>
+        </w:rPr>
+      </w:pPr>
+    </w:p>
+    <w:p>
+      <w:pPr>
+        <w:rPr>
+          <w:rFonts w:cs="Times New Roman"/>
+          <w:b/>
+          <w:bCs/>
+          <w:kern w:val="0"/>
+          <w:sz w:val="24"/>
+          <w:lang w:val="en-AU"/>
+        </w:rPr>
+      </w:pPr>
+      <w:r>
+        <w:rPr>
+          <w:rFonts w:cs="Times New Roman"/>
+          <w:b/>
+          <w:bCs/>
+          <w:kern w:val="0"/>
+          <w:sz w:val="24"/>
+          <w:lang w:val="en-AU"/>
+        </w:rPr>
+        <w:t>5.Profile page</w:t>
+      </w:r>
+    </w:p>
+    <w:p>
+      <w:pPr>
         <w:rPr>
           <w:rFonts w:cs="Times New Roman"/>
           <w:kern w:val="0"/>
           <w:sz w:val="24"/>
-        </w:rPr>
-        <w:t xml:space="preserve"> redirects now function correctly.</w:t>
-      </w:r>
+          <w:lang w:val="en-AU"/>
+        </w:rPr>
+      </w:pPr>
       <w:r>
         <w:rPr>
           <w:rFonts w:cs="Times New Roman"/>
           <w:kern w:val="0"/>
           <w:sz w:val="24"/>
-        </w:rPr>
-        <w:tab/>
+          <w:lang w:val="en-AU"/>
+        </w:rPr>
+        <w:t>5.</w:t>
+      </w:r>
+      <w:r>
+        <w:rPr>
+          <w:rFonts w:cs="Times New Roman" w:hint="eastAsia"/>
+          <w:kern w:val="0"/>
+          <w:sz w:val="24"/>
+          <w:lang w:val="en-AU"/>
+        </w:rPr>
+        <w:t>1</w:t>
+      </w:r>
+    </w:p>
+    <w:p>
+      <w:pPr>
+        <w:pStyle w:val="p1"/>
+        <w:spacing w:before="0" w:beforeAutospacing="0" w:after="0" w:afterAutospacing="0"/>
+        <w:contextualSpacing/>
+        <w:rPr>
+          <w:rFonts w:asciiTheme="minorHAnsi" w:eastAsiaTheme="minorEastAsia" w:hAnsiTheme="minorHAnsi" w:cs="Times New Roman"/>
+        </w:rPr>
+      </w:pPr>
+      <w:r>
+        <w:rPr>
+          <w:rFonts w:asciiTheme="minorHAnsi" w:eastAsiaTheme="minorEastAsia" w:hAnsiTheme="minorHAnsi"/>
+        </w:rPr>
+        <w:t>1.</w:t>
+      </w:r>
+      <w:r>
+        <w:rPr>
+          <w:rFonts w:asciiTheme="minorHAnsi" w:eastAsiaTheme="minorEastAsia" w:hAnsiTheme="minorHAnsi" w:hint="eastAsia"/>
+        </w:rPr>
+        <w:t xml:space="preserve"> </w:t>
+      </w:r>
+      <w:r>
+        <w:rPr>
+          <w:rFonts w:asciiTheme="minorHAnsi" w:eastAsiaTheme="minorEastAsia" w:hAnsiTheme="minorHAnsi"/>
+        </w:rPr>
+        <w:t>Upgraded the profile page from a static demo page to a dynamic functional page:</w:t>
+      </w:r>
+      <w:r>
+        <w:rPr>
+          <w:rFonts w:asciiTheme="minorHAnsi" w:eastAsiaTheme="minorEastAsia" w:hAnsiTheme="minorHAnsi" w:cs="Times New Roman" w:hint="cs"/>
+        </w:rPr>
+        <w:t xml:space="preserve"> The </w:t>
+      </w:r>
+      <w:proofErr w:type="spellStart"/>
+      <w:r>
+        <w:rPr>
+          <w:rFonts w:asciiTheme="minorHAnsi" w:eastAsiaTheme="minorEastAsia" w:hAnsiTheme="minorHAnsi" w:cs="Times New Roman" w:hint="cs"/>
+        </w:rPr>
+        <w:t>ProfilePage.vue</w:t>
+      </w:r>
+      <w:proofErr w:type="spellEnd"/>
+      <w:r>
+        <w:rPr>
+          <w:rFonts w:asciiTheme="minorHAnsi" w:eastAsiaTheme="minorEastAsia" w:hAnsiTheme="minorHAnsi" w:cs="Times New Roman" w:hint="cs"/>
+        </w:rPr>
+        <w:t xml:space="preserve"> component was improved so that it now displays the real information of the currently logged-in user instead of only showing static demonstration content.</w:t>
+      </w:r>
+    </w:p>
+    <w:p>
+      <w:pPr>
+        <w:pStyle w:val="p1"/>
+        <w:contextualSpacing/>
+        <w:rPr>
+          <w:rFonts w:asciiTheme="minorHAnsi" w:eastAsiaTheme="minorEastAsia" w:hAnsiTheme="minorHAnsi" w:cs="Times New Roman" w:hint="cs"/>
+        </w:rPr>
+      </w:pPr>
+      <w:r>
+        <w:rPr>
+          <w:rFonts w:asciiTheme="minorHAnsi" w:eastAsiaTheme="minorEastAsia" w:hAnsiTheme="minorHAnsi"/>
+        </w:rPr>
+        <w:t>2.</w:t>
+      </w:r>
+      <w:r>
+        <w:rPr>
+          <w:rFonts w:asciiTheme="minorHAnsi" w:eastAsiaTheme="minorEastAsia" w:hAnsiTheme="minorHAnsi" w:hint="eastAsia"/>
+        </w:rPr>
+        <w:t xml:space="preserve"> </w:t>
+      </w:r>
+      <w:r>
+        <w:rPr>
+          <w:rFonts w:asciiTheme="minorHAnsi" w:eastAsiaTheme="minorEastAsia" w:hAnsiTheme="minorHAnsi"/>
+        </w:rPr>
+        <w:t>Supported multiple user data structures:</w:t>
+      </w:r>
+      <w:r>
+        <w:rPr>
+          <w:rFonts w:asciiTheme="minorHAnsi" w:eastAsiaTheme="minorEastAsia" w:hAnsiTheme="minorHAnsi" w:cs="Times New Roman" w:hint="cs"/>
+        </w:rPr>
+        <w:t xml:space="preserve"> The profile page was updated to handle different possible user data formats, which improves compatibility and makes the page more robust when working with varying backend responses.</w:t>
+      </w:r>
+    </w:p>
+    <w:p>
+      <w:pPr>
+        <w:pStyle w:val="p1"/>
+        <w:contextualSpacing/>
+        <w:rPr>
+          <w:rFonts w:asciiTheme="minorHAnsi" w:eastAsiaTheme="minorEastAsia" w:hAnsiTheme="minorHAnsi" w:cs="Times New Roman" w:hint="eastAsia"/>
+        </w:rPr>
+      </w:pPr>
+      <w:r>
+        <w:rPr>
+          <w:rFonts w:asciiTheme="minorHAnsi" w:eastAsiaTheme="minorEastAsia" w:hAnsiTheme="minorHAnsi"/>
+        </w:rPr>
+        <w:t>3.</w:t>
+      </w:r>
+      <w:r>
+        <w:rPr>
+          <w:rFonts w:asciiTheme="minorHAnsi" w:eastAsiaTheme="minorEastAsia" w:hAnsiTheme="minorHAnsi" w:hint="eastAsia"/>
+        </w:rPr>
+        <w:t xml:space="preserve"> </w:t>
+      </w:r>
+      <w:r>
+        <w:rPr>
+          <w:rFonts w:asciiTheme="minorHAnsi" w:eastAsiaTheme="minorEastAsia" w:hAnsiTheme="minorHAnsi"/>
+        </w:rPr>
+        <w:t>Enabled automatic retrieval of updated user information:</w:t>
+      </w:r>
+      <w:r>
+        <w:rPr>
+          <w:rFonts w:asciiTheme="minorHAnsi" w:eastAsiaTheme="minorEastAsia" w:hAnsiTheme="minorHAnsi" w:cs="Times New Roman" w:hint="cs"/>
+        </w:rPr>
+        <w:t xml:space="preserve"> The page can now automatically fetch and display updated user data, allowing profile information to stay more consistent with the current authentication state of the system.</w:t>
       </w:r>
     </w:p>
     <w:sectPr>
@@ -3919,6 +4090,95 @@
     </w:lvl>
   </w:abstractNum>
   <w:abstractNum w:abstractNumId="1" w15:restartNumberingAfterBreak="0">
+    <w:nsid w:val="04C34D0B"/>
+    <w:multiLevelType w:val="hybridMultilevel"/>
+    <w:tmpl w:val="7D7EC3C2"/>
+    <w:lvl w:ilvl="0" w:tplc="E0BE61F6">
+      <w:start w:val="4"/>
+      <w:numFmt w:val="decimal"/>
+      <w:lvlText w:val="%1．"/>
+      <w:lvlJc w:val="left"/>
+      <w:pPr>
+        <w:ind w:left="360" w:hanging="360"/>
+      </w:pPr>
+      <w:rPr>
+        <w:rFonts w:hint="default"/>
+      </w:rPr>
+    </w:lvl>
+    <w:lvl w:ilvl="1" w:tplc="04090019" w:tentative="1">
+      <w:start w:val="1"/>
+      <w:numFmt w:val="lowerLetter"/>
+      <w:lvlText w:val="%2)"/>
+      <w:lvlJc w:val="left"/>
+      <w:pPr>
+        <w:ind w:left="880" w:hanging="440"/>
+      </w:pPr>
+    </w:lvl>
+    <w:lvl w:ilvl="2" w:tplc="0409001B" w:tentative="1">
+      <w:start w:val="1"/>
+      <w:numFmt w:val="lowerRoman"/>
+      <w:lvlText w:val="%3."/>
+      <w:lvlJc w:val="right"/>
+      <w:pPr>
+        <w:ind w:left="1320" w:hanging="440"/>
+      </w:pPr>
+    </w:lvl>
+    <w:lvl w:ilvl="3" w:tplc="0409000F" w:tentative="1">
+      <w:start w:val="1"/>
+      <w:numFmt w:val="decimal"/>
+      <w:lvlText w:val="%4."/>
+      <w:lvlJc w:val="left"/>
+      <w:pPr>
+        <w:ind w:left="1760" w:hanging="440"/>
+      </w:pPr>
+    </w:lvl>
+    <w:lvl w:ilvl="4" w:tplc="04090019" w:tentative="1">
+      <w:start w:val="1"/>
+      <w:numFmt w:val="lowerLetter"/>
+      <w:lvlText w:val="%5)"/>
+      <w:lvlJc w:val="left"/>
+      <w:pPr>
+        <w:ind w:left="2200" w:hanging="440"/>
+      </w:pPr>
+    </w:lvl>
+    <w:lvl w:ilvl="5" w:tplc="0409001B" w:tentative="1">
+      <w:start w:val="1"/>
+      <w:numFmt w:val="lowerRoman"/>
+      <w:lvlText w:val="%6."/>
+      <w:lvlJc w:val="right"/>
+      <w:pPr>
+        <w:ind w:left="2640" w:hanging="440"/>
+      </w:pPr>
+    </w:lvl>
+    <w:lvl w:ilvl="6" w:tplc="0409000F" w:tentative="1">
+      <w:start w:val="1"/>
+      <w:numFmt w:val="decimal"/>
+      <w:lvlText w:val="%7."/>
+      <w:lvlJc w:val="left"/>
+      <w:pPr>
+        <w:ind w:left="3080" w:hanging="440"/>
+      </w:pPr>
+    </w:lvl>
+    <w:lvl w:ilvl="7" w:tplc="04090019" w:tentative="1">
+      <w:start w:val="1"/>
+      <w:numFmt w:val="lowerLetter"/>
+      <w:lvlText w:val="%8)"/>
+      <w:lvlJc w:val="left"/>
+      <w:pPr>
+        <w:ind w:left="3520" w:hanging="440"/>
+      </w:pPr>
+    </w:lvl>
+    <w:lvl w:ilvl="8" w:tplc="0409001B" w:tentative="1">
+      <w:start w:val="1"/>
+      <w:numFmt w:val="lowerRoman"/>
+      <w:lvlText w:val="%9."/>
+      <w:lvlJc w:val="right"/>
+      <w:pPr>
+        <w:ind w:left="3960" w:hanging="440"/>
+      </w:pPr>
+    </w:lvl>
+  </w:abstractNum>
+  <w:abstractNum w:abstractNumId="2" w15:restartNumberingAfterBreak="0">
     <w:nsid w:val="0E233AE2"/>
     <w:multiLevelType w:val="singleLevel"/>
     <w:tmpl w:val="0E233AE2"/>
@@ -3934,7 +4194,156 @@
       </w:pPr>
     </w:lvl>
   </w:abstractNum>
-  <w:abstractNum w:abstractNumId="2" w15:restartNumberingAfterBreak="0">
+  <w:abstractNum w:abstractNumId="3" w15:restartNumberingAfterBreak="0">
+    <w:nsid w:val="279243F4"/>
+    <w:multiLevelType w:val="multilevel"/>
+    <w:tmpl w:val="6CEAEED8"/>
+    <w:lvl w:ilvl="0">
+      <w:start w:val="1"/>
+      <w:numFmt w:val="bullet"/>
+      <w:lvlText w:val=""/>
+      <w:lvlJc w:val="left"/>
+      <w:pPr>
+        <w:tabs>
+          <w:tab w:val="num" w:pos="720"/>
+        </w:tabs>
+        <w:ind w:left="720" w:hanging="360"/>
+      </w:pPr>
+      <w:rPr>
+        <w:rFonts w:ascii="Symbol" w:hAnsi="Symbol" w:hint="default"/>
+        <w:sz w:val="20"/>
+      </w:rPr>
+    </w:lvl>
+    <w:lvl w:ilvl="1" w:tentative="1">
+      <w:start w:val="1"/>
+      <w:numFmt w:val="bullet"/>
+      <w:lvlText w:val="o"/>
+      <w:lvlJc w:val="left"/>
+      <w:pPr>
+        <w:tabs>
+          <w:tab w:val="num" w:pos="1440"/>
+        </w:tabs>
+        <w:ind w:left="1440" w:hanging="360"/>
+      </w:pPr>
+      <w:rPr>
+        <w:rFonts w:ascii="Courier New" w:hAnsi="Courier New" w:hint="default"/>
+        <w:sz w:val="20"/>
+      </w:rPr>
+    </w:lvl>
+    <w:lvl w:ilvl="2" w:tentative="1">
+      <w:start w:val="1"/>
+      <w:numFmt w:val="bullet"/>
+      <w:lvlText w:val=""/>
+      <w:lvlJc w:val="left"/>
+      <w:pPr>
+        <w:tabs>
+          <w:tab w:val="num" w:pos="2160"/>
+        </w:tabs>
+        <w:ind w:left="2160" w:hanging="360"/>
+      </w:pPr>
+      <w:rPr>
+        <w:rFonts w:ascii="Wingdings" w:hAnsi="Wingdings" w:hint="default"/>
+        <w:sz w:val="20"/>
+      </w:rPr>
+    </w:lvl>
+    <w:lvl w:ilvl="3" w:tentative="1">
+      <w:start w:val="1"/>
+      <w:numFmt w:val="bullet"/>
+      <w:lvlText w:val=""/>
+      <w:lvlJc w:val="left"/>
+      <w:pPr>
+        <w:tabs>
+          <w:tab w:val="num" w:pos="2880"/>
+        </w:tabs>
+        <w:ind w:left="2880" w:hanging="360"/>
+      </w:pPr>
+      <w:rPr>
+        <w:rFonts w:ascii="Wingdings" w:hAnsi="Wingdings" w:hint="default"/>
+        <w:sz w:val="20"/>
+      </w:rPr>
+    </w:lvl>
+    <w:lvl w:ilvl="4" w:tentative="1">
+      <w:start w:val="1"/>
+      <w:numFmt w:val="bullet"/>
+      <w:lvlText w:val=""/>
+      <w:lvlJc w:val="left"/>
+      <w:pPr>
+        <w:tabs>
+          <w:tab w:val="num" w:pos="3600"/>
+        </w:tabs>
+        <w:ind w:left="3600" w:hanging="360"/>
+      </w:pPr>
+      <w:rPr>
+        <w:rFonts w:ascii="Wingdings" w:hAnsi="Wingdings" w:hint="default"/>
+        <w:sz w:val="20"/>
+      </w:rPr>
+    </w:lvl>
+    <w:lvl w:ilvl="5" w:tentative="1">
+      <w:start w:val="1"/>
+      <w:numFmt w:val="bullet"/>
+      <w:lvlText w:val=""/>
+      <w:lvlJc w:val="left"/>
+      <w:pPr>
+        <w:tabs>
+          <w:tab w:val="num" w:pos="4320"/>
+        </w:tabs>
+        <w:ind w:left="4320" w:hanging="360"/>
+      </w:pPr>
+      <w:rPr>
+        <w:rFonts w:ascii="Wingdings" w:hAnsi="Wingdings" w:hint="default"/>
+        <w:sz w:val="20"/>
+      </w:rPr>
+    </w:lvl>
+    <w:lvl w:ilvl="6" w:tentative="1">
+      <w:start w:val="1"/>
+      <w:numFmt w:val="bullet"/>
+      <w:lvlText w:val=""/>
+      <w:lvlJc w:val="left"/>
+      <w:pPr>
+        <w:tabs>
+          <w:tab w:val="num" w:pos="5040"/>
+        </w:tabs>
+        <w:ind w:left="5040" w:hanging="360"/>
+      </w:pPr>
+      <w:rPr>
+        <w:rFonts w:ascii="Wingdings" w:hAnsi="Wingdings" w:hint="default"/>
+        <w:sz w:val="20"/>
+      </w:rPr>
+    </w:lvl>
+    <w:lvl w:ilvl="7" w:tentative="1">
+      <w:start w:val="1"/>
+      <w:numFmt w:val="bullet"/>
+      <w:lvlText w:val=""/>
+      <w:lvlJc w:val="left"/>
+      <w:pPr>
+        <w:tabs>
+          <w:tab w:val="num" w:pos="5760"/>
+        </w:tabs>
+        <w:ind w:left="5760" w:hanging="360"/>
+      </w:pPr>
+      <w:rPr>
+        <w:rFonts w:ascii="Wingdings" w:hAnsi="Wingdings" w:hint="default"/>
+        <w:sz w:val="20"/>
+      </w:rPr>
+    </w:lvl>
+    <w:lvl w:ilvl="8" w:tentative="1">
+      <w:start w:val="1"/>
+      <w:numFmt w:val="bullet"/>
+      <w:lvlText w:val=""/>
+      <w:lvlJc w:val="left"/>
+      <w:pPr>
+        <w:tabs>
+          <w:tab w:val="num" w:pos="6480"/>
+        </w:tabs>
+        <w:ind w:left="6480" w:hanging="360"/>
+      </w:pPr>
+      <w:rPr>
+        <w:rFonts w:ascii="Wingdings" w:hAnsi="Wingdings" w:hint="default"/>
+        <w:sz w:val="20"/>
+      </w:rPr>
+    </w:lvl>
+  </w:abstractNum>
+  <w:abstractNum w:abstractNumId="4" w15:restartNumberingAfterBreak="0">
     <w:nsid w:val="2FFFCEEE"/>
     <w:multiLevelType w:val="singleLevel"/>
     <w:tmpl w:val="2FFFCEEE"/>
@@ -3950,7 +4359,7 @@
       </w:pPr>
     </w:lvl>
   </w:abstractNum>
-  <w:abstractNum w:abstractNumId="3" w15:restartNumberingAfterBreak="0">
+  <w:abstractNum w:abstractNumId="5" w15:restartNumberingAfterBreak="0">
     <w:nsid w:val="582E63B7"/>
     <w:multiLevelType w:val="singleLevel"/>
     <w:tmpl w:val="582E63B7"/>
@@ -3968,7 +4377,7 @@
       </w:rPr>
     </w:lvl>
   </w:abstractNum>
-  <w:abstractNum w:abstractNumId="4" w15:restartNumberingAfterBreak="0">
+  <w:abstractNum w:abstractNumId="6" w15:restartNumberingAfterBreak="0">
     <w:nsid w:val="78C31E7F"/>
     <w:multiLevelType w:val="singleLevel"/>
     <w:tmpl w:val="78C31E7F"/>
@@ -3984,7 +4393,7 @@
       </w:pPr>
     </w:lvl>
   </w:abstractNum>
-  <w:abstractNum w:abstractNumId="5" w15:restartNumberingAfterBreak="0">
+  <w:abstractNum w:abstractNumId="7" w15:restartNumberingAfterBreak="0">
     <w:nsid w:val="7DE93315"/>
     <w:multiLevelType w:val="hybridMultilevel"/>
     <w:tmpl w:val="E9482E92"/>
@@ -4077,19 +4486,25 @@
     <w:abstractNumId w:val="0"/>
   </w:num>
   <w:num w:numId="2" w16cid:durableId="1503475020">
+    <w:abstractNumId w:val="4"/>
+  </w:num>
+  <w:num w:numId="3" w16cid:durableId="1601645793">
     <w:abstractNumId w:val="2"/>
   </w:num>
-  <w:num w:numId="3" w16cid:durableId="1601645793">
+  <w:num w:numId="4" w16cid:durableId="2136172688">
+    <w:abstractNumId w:val="5"/>
+  </w:num>
+  <w:num w:numId="5" w16cid:durableId="1942834831">
+    <w:abstractNumId w:val="6"/>
+  </w:num>
+  <w:num w:numId="6" w16cid:durableId="999889503">
+    <w:abstractNumId w:val="7"/>
+  </w:num>
+  <w:num w:numId="7" w16cid:durableId="2082831390">
     <w:abstractNumId w:val="1"/>
   </w:num>
-  <w:num w:numId="4" w16cid:durableId="2136172688">
+  <w:num w:numId="8" w16cid:durableId="1005282578">
     <w:abstractNumId w:val="3"/>
-  </w:num>
-  <w:num w:numId="5" w16cid:durableId="1942834831">
-    <w:abstractNumId w:val="4"/>
-  </w:num>
-  <w:num w:numId="6" w16cid:durableId="999889503">
-    <w:abstractNumId w:val="5"/>
   </w:num>
 </w:numbering>
 </file>
@@ -4589,6 +5004,26 @@
       <w:ind w:firstLineChars="200" w:firstLine="420"/>
     </w:pPr>
   </w:style>
+  <w:style w:type="paragraph" w:customStyle="1" w:styleId="p1">
+    <w:name w:val="p1"/>
+    <w:basedOn w:val="a"/>
+    <w:rsid w:val="008A7F63"/>
+    <w:pPr>
+      <w:widowControl/>
+      <w:spacing w:before="100" w:beforeAutospacing="1" w:after="100" w:afterAutospacing="1"/>
+      <w:jc w:val="left"/>
+    </w:pPr>
+    <w:rPr>
+      <w:rFonts w:ascii="宋体" w:eastAsia="宋体" w:hAnsi="宋体" w:cs="宋体"/>
+      <w:kern w:val="0"/>
+      <w:sz w:val="24"/>
+    </w:rPr>
+  </w:style>
+  <w:style w:type="character" w:customStyle="1" w:styleId="s1">
+    <w:name w:val="s1"/>
+    <w:basedOn w:val="a0"/>
+    <w:rsid w:val="008A7F63"/>
+  </w:style>
 </w:styles>
 </file>
 

</xml_diff>